<commit_message>
Release v1.4.0 employee mover workflow
</commit_message>
<xml_diff>
--- a/docs/Jira-Reminders-KB.docx
+++ b/docs/Jira-Reminders-KB.docx
@@ -148,7 +148,7 @@
               <w:spacing w:after="0"/>
             </w:pPr>
             <w:r>
-              <w:t>1.3.1</w:t>
+              <w:t>1.4.0</w:t>
             </w:r>
           </w:p>
         </w:tc>
@@ -253,7 +253,7 @@
     </w:p>
     <w:p>
       <w:r>
-        <w:t>Jira Reminders brings assigned employee-onboarding tickets, reminders, the onboarding checklist, Active Directory setup, Jira comments, and optional Snipe-IT asset information into one Windows application.</w:t>
+        <w:t>Jira Reminders brings assigned employee-onboarding and employee-moving tickets, reminders, the onboarding checklist, Active Directory setup, Jira comments, and optional Snipe-IT asset information into one Windows application.</w:t>
       </w:r>
     </w:p>
     <w:p>
@@ -287,7 +287,7 @@
               <w:t>Ticket scope:</w:t>
             </w:r>
             <w:r>
-              <w:t xml:space="preserve"> Jira Reminders displays onboarding tickets assigned to the signed-in Jira user. It does not display the entire location queue.</w:t>
+              <w:t xml:space="preserve"> Jira Reminders displays onboarding and employee-moving tickets assigned to the signed-in Jira user. It does not display the entire location queue.</w:t>
             </w:r>
           </w:p>
         </w:tc>
@@ -297,6 +297,56 @@
       <w:pPr>
         <w:spacing w:after="0"/>
       </w:pPr>
+    </w:p>
+    <w:p>
+      <w:pPr>
+        <w:pStyle w:val="Heading1"/>
+      </w:pPr>
+      <w:r>
+        <w:t>Employee movers</w:t>
+      </w:r>
+    </w:p>
+    <w:p>
+      <w:r>
+        <w:t xml:space="preserve">Use the </w:t>
+      </w:r>
+      <w:r>
+        <w:rPr>
+          <w:b/>
+        </w:rPr>
+        <w:t>Movers</w:t>
+      </w:r>
+      <w:r>
+        <w:t xml:space="preserve"> tab for assigned Jira issues of type </w:t>
+      </w:r>
+      <w:r>
+        <w:rPr>
+          <w:b/>
+        </w:rPr>
+        <w:t>Employee moving</w:t>
+      </w:r>
+      <w:r>
+        <w:t xml:space="preserve">. Review the effective date, new job title, company, manager, Buddy, and Axapta rights before selecting </w:t>
+      </w:r>
+      <w:r>
+        <w:rPr>
+          <w:b/>
+        </w:rPr>
+        <w:t>Prepare AD move</w:t>
+      </w:r>
+      <w:r>
+        <w:t>.</w:t>
+      </w:r>
+    </w:p>
+    <w:p>
+      <w:r>
+        <w:t>The mover workflow changes only Active Directory. It aligns copyable direct groups and the OU with the Buddy, uses the Buddy's Department, applies the Jira new title to both Title and Description, and applies the Jira Company and Manager. Address fields come from the same validated company/location mappings used for onboarding. Email, password, UPN, and proxy addresses are preserved.</w:t>
+      </w:r>
+    </w:p>
+    <w:p>
+      <w:r>
+        <w:t>If Buddy and Axapta rights differ, Buddy remains the AD template and the app shows the separate Axapta user as a follow-up. If Buddy is empty, Axapta rights is used as the AD buddy. The app blocks an ambiguous or disabled account, unknown address, unacknowledged manager mismatch, invalid OU, or stale preview. Completion is saved only after final AD verification passes.</w:t>
+      </w:r>
     </w:p>
     <w:p>
       <w:pPr>
@@ -399,7 +449,7 @@
             <w:color w:val="0C66E4"/>
             <w:u w:val="single"/>
           </w:rPr>
-          <w:t>Jira Reminders v1.3.1 release</w:t>
+          <w:t>Jira Reminders v1.4.0 release</w:t>
         </w:r>
       </w:hyperlink>
       <w:r>
@@ -421,7 +471,7 @@
             <w:color w:val="0C66E4"/>
             <w:u w:val="single"/>
           </w:rPr>
-          <w:t>Jira-Reminders-1.3.1.msi</w:t>
+          <w:t>Jira-Reminders-1.4.0.msi</w:t>
         </w:r>
       </w:hyperlink>
       <w:r>
@@ -534,7 +584,7 @@
               <w:t>Unknown publisher:</w:t>
             </w:r>
             <w:r>
-              <w:t xml:space="preserve"> Version 1.3.1 is not Authenticode-signed, so Windows may show an </w:t>
+              <w:t xml:space="preserve"> Version 1.4.0 is not Authenticode-signed, so Windows may show an </w:t>
             </w:r>
             <w:r>
               <w:rPr>
@@ -2604,7 +2654,7 @@
             <w:color w:val="0C66E4"/>
             <w:u w:val="single"/>
           </w:rPr>
-          <w:t>Jira Reminders v1.3.1 release</w:t>
+          <w:t>Jira Reminders v1.4.0 release</w:t>
         </w:r>
       </w:hyperlink>
     </w:p>
@@ -2646,7 +2696,7 @@
         <w:color w:val="5E6C84"/>
         <w:sz w:val="16"/>
       </w:rPr>
-      <w:t>Jira Reminders KB  |  Version 1.3.1  |  31 July 2026</w:t>
+      <w:t>Jira Reminders KB  |  Version 1.4.0  |  4 August 2026</w:t>
     </w:r>
   </w:p>
 </w:ftr>

</xml_diff>

<commit_message>
Release v1.5.0 safer account and group handling
</commit_message>
<xml_diff>
--- a/docs/Jira-Reminders-KB.docx
+++ b/docs/Jira-Reminders-KB.docx
@@ -148,7 +148,7 @@
               <w:spacing w:after="0"/>
             </w:pPr>
             <w:r>
-              <w:t>1.4.0</w:t>
+              <w:t>1.5.0</w:t>
             </w:r>
           </w:p>
         </w:tc>
@@ -204,7 +204,7 @@
               <w:spacing w:after="0"/>
             </w:pPr>
             <w:r>
-              <w:t>31 July 2026</w:t>
+              <w:t>17 August 2026</w:t>
             </w:r>
           </w:p>
         </w:tc>
@@ -340,12 +340,55 @@
     </w:p>
     <w:p>
       <w:r>
-        <w:t>The mover workflow changes only Active Directory. It aligns copyable direct groups and the OU with the Buddy, uses the Buddy's Department, applies the Jira new title to both Title and Description, and applies the Jira Company and Manager. Address fields come from the same validated company/location mappings used for onboarding. Email, password, UPN, and proxy addresses are preserved.</w:t>
+        <w:t>If an employee, Buddy, or manager search finds multiple enabled AD accounts, select the intended username in the mover window. The selector includes each account's title and OU so service accounts such as 3CX accounts can be excluded. The app rebuilds the complete preview after the selection.</w:t>
       </w:r>
     </w:p>
     <w:p>
       <w:r>
-        <w:t>If Buddy and Axapta rights differ, Buddy remains the AD template and the app shows the separate Axapta user as a follow-up. If Buddy is empty, Axapta rights is used as the AD buddy. The app blocks an ambiguous or disabled account, unknown address, unacknowledged manager mismatch, invalid OU, or stale preview. Completion is saved only after final AD verification passes.</w:t>
+        <w:t>The mover workflow changes only Active Directory. It aligns copyable direct groups and the OU with the Buddy, uses the Buddy's Department, applies the Jira new title to both Title and Description, and applies the Jira Company and Manager. Address fields come from the same validated company/location mappings used for onboarding. Email, password, UPN, and proxy addresses are preserved. Jira ticket status changes remain manual.</w:t>
+      </w:r>
+    </w:p>
+    <w:p>
+      <w:r>
+        <w:t>If Buddy and Axapta rights differ, Buddy remains the AD template and the app shows the separate Axapta user as a follow-up. If Buddy is empty, Axapta rights is used as the AD buddy. Multiple enabled accounts require explicit selection. The app blocks a disabled account, unknown address, unacknowledged manager mismatch, invalid OU, or stale preview. Completion is saved only after final AD verification passes.</w:t>
+      </w:r>
+    </w:p>
+    <w:p>
+      <w:r>
+        <w:t xml:space="preserve">Permission-controlled memberships found in the audit history—including </w:t>
+      </w:r>
+      <w:r>
+        <w:rPr>
+          <w:rFonts w:ascii="Consolas" w:hAnsi="Consolas"/>
+          <w:color w:val="172B4D"/>
+          <w:sz w:val="18"/>
+        </w:rPr>
+        <w:t>Disable_USB</w:t>
+      </w:r>
+      <w:r>
+        <w:t xml:space="preserve">, </w:t>
+      </w:r>
+      <w:r>
+        <w:rPr>
+          <w:rFonts w:ascii="Consolas" w:hAnsi="Consolas"/>
+          <w:color w:val="172B4D"/>
+          <w:sz w:val="18"/>
+        </w:rPr>
+        <w:t>VPN_IT_integracijos</w:t>
+      </w:r>
+      <w:r>
+        <w:t xml:space="preserve">, and </w:t>
+      </w:r>
+      <w:r>
+        <w:rPr>
+          <w:rFonts w:ascii="Consolas" w:hAnsi="Consolas"/>
+          <w:color w:val="172B4D"/>
+          <w:sz w:val="18"/>
+        </w:rPr>
+        <w:t>GrayList_WillGrow Users</w:t>
+      </w:r>
+      <w:r>
+        <w:t>—are excluded from automatic copying and remain a manual follow-up. If AD denies another group addition or removal, the mover workflow continues applying the remaining safe changes, reports every failed membership in the execution output, and does not record the move as complete.</w:t>
       </w:r>
     </w:p>
     <w:p>

</xml_diff>

<commit_message>
Release v1.5.2 reliable automatic updates
</commit_message>
<xml_diff>
--- a/docs/Jira-Reminders-KB.docx
+++ b/docs/Jira-Reminders-KB.docx
@@ -148,7 +148,7 @@
               <w:spacing w:after="0"/>
             </w:pPr>
             <w:r>
-              <w:t>1.5.1</w:t>
+              <w:t>1.5.2</w:t>
             </w:r>
           </w:p>
         </w:tc>
@@ -492,7 +492,7 @@
             <w:color w:val="0C66E4"/>
             <w:u w:val="single"/>
           </w:rPr>
-          <w:t>Jira Reminders v1.4.0 release</w:t>
+          <w:t>Jira Reminders v1.5.2 release</w:t>
         </w:r>
       </w:hyperlink>
       <w:r>
@@ -514,7 +514,7 @@
             <w:color w:val="0C66E4"/>
             <w:u w:val="single"/>
           </w:rPr>
-          <w:t>Jira-Reminders-1.4.0.msi</w:t>
+          <w:t>Jira-Reminders-1.5.2.msi</w:t>
         </w:r>
       </w:hyperlink>
       <w:r>
@@ -627,7 +627,7 @@
               <w:t>Unknown publisher:</w:t>
             </w:r>
             <w:r>
-              <w:t xml:space="preserve"> Version 1.4.0 is not Authenticode-signed, so Windows may show an </w:t>
+              <w:t xml:space="preserve"> Version 1.5.2 is not Authenticode-signed, so Windows may show an </w:t>
             </w:r>
             <w:r>
               <w:rPr>
@@ -2697,7 +2697,7 @@
             <w:color w:val="0C66E4"/>
             <w:u w:val="single"/>
           </w:rPr>
-          <w:t>Jira Reminders v1.4.0 release</w:t>
+          <w:t>Jira Reminders v1.5.2 release</w:t>
         </w:r>
       </w:hyperlink>
     </w:p>

</xml_diff>

<commit_message>
Release v1.5.3 manual AD account fallback
</commit_message>
<xml_diff>
--- a/docs/Jira-Reminders-KB.docx
+++ b/docs/Jira-Reminders-KB.docx
@@ -148,7 +148,7 @@
               <w:spacing w:after="0"/>
             </w:pPr>
             <w:r>
-              <w:t>1.5.2</w:t>
+              <w:t>1.5.3</w:t>
             </w:r>
           </w:p>
         </w:tc>
@@ -204,7 +204,7 @@
               <w:spacing w:after="0"/>
             </w:pPr>
             <w:r>
-              <w:t>17 August 2026</w:t>
+              <w:t>21 August 2026</w:t>
             </w:r>
           </w:p>
         </w:tc>
@@ -492,7 +492,7 @@
             <w:color w:val="0C66E4"/>
             <w:u w:val="single"/>
           </w:rPr>
-          <w:t>Jira Reminders v1.5.2 release</w:t>
+          <w:t>Jira Reminders v1.5.3 release</w:t>
         </w:r>
       </w:hyperlink>
       <w:r>
@@ -514,7 +514,7 @@
             <w:color w:val="0C66E4"/>
             <w:u w:val="single"/>
           </w:rPr>
-          <w:t>Jira-Reminders-1.5.2.msi</w:t>
+          <w:t>Jira-Reminders-1.5.3.msi</w:t>
         </w:r>
       </w:hyperlink>
       <w:r>
@@ -627,7 +627,7 @@
               <w:t>Unknown publisher:</w:t>
             </w:r>
             <w:r>
-              <w:t xml:space="preserve"> Version 1.5.2 is not Authenticode-signed, so Windows may show an </w:t>
+              <w:t xml:space="preserve"> Version 1.5.3 is not Authenticode-signed, so Windows may show an </w:t>
             </w:r>
             <w:r>
               <w:rPr>
@@ -2697,7 +2697,7 @@
             <w:color w:val="0C66E4"/>
             <w:u w:val="single"/>
           </w:rPr>
-          <w:t>Jira Reminders v1.5.2 release</w:t>
+          <w:t>Jira Reminders v1.5.3 release</w:t>
         </w:r>
       </w:hyperlink>
     </w:p>

</xml_diff>

<commit_message>
Release v1.6.0 dedicated onboarding updates
</commit_message>
<xml_diff>
--- a/docs/Jira-Reminders-KB.docx
+++ b/docs/Jira-Reminders-KB.docx
@@ -148,7 +148,7 @@
               <w:spacing w:after="0"/>
             </w:pPr>
             <w:r>
-              <w:t>1.5.3</w:t>
+              <w:t>1.6.0</w:t>
             </w:r>
           </w:p>
         </w:tc>
@@ -345,7 +345,78 @@
     </w:p>
     <w:p>
       <w:r>
-        <w:t>The mover workflow changes only Active Directory. It aligns copyable direct groups and the OU with the Buddy, uses the Buddy's Department, applies the Jira new title to both Title and Description, and applies the Jira Company and Manager. Address fields come from the same validated company/location mappings used for onboarding. Email, password, UPN, and proxy addresses are preserved. Jira ticket status changes remain manual.</w:t>
+        <w:t>The mover workflow changes only Active Directory. It aligns copyable direct groups and the OU with the Buddy, uses the Buddy's Department, applies the Jira new title to both Title and Description, and applies the Jira Company and Manager. Address fields come from the same validated company/location mappings used for onboarding. Password and UPN are preserved, as are email and proxy addresses except for the Girteka Dedicated rule below. Jira ticket status changes remain manual.</w:t>
+      </w:r>
+    </w:p>
+    <w:p>
+      <w:r>
+        <w:t xml:space="preserve">The exception is a target company named </w:t>
+      </w:r>
+      <w:r>
+        <w:rPr>
+          <w:rFonts w:ascii="Consolas" w:hAnsi="Consolas"/>
+          <w:color w:val="172B4D"/>
+          <w:sz w:val="18"/>
+        </w:rPr>
+        <w:t>TNDM</w:t>
+      </w:r>
+      <w:r>
+        <w:t xml:space="preserve">, </w:t>
+      </w:r>
+      <w:r>
+        <w:rPr>
+          <w:rFonts w:ascii="Consolas" w:hAnsi="Consolas"/>
+          <w:color w:val="172B4D"/>
+          <w:sz w:val="18"/>
+        </w:rPr>
+        <w:t>TNDM Trucking</w:t>
+      </w:r>
+      <w:r>
+        <w:t xml:space="preserve">, or </w:t>
+      </w:r>
+      <w:r>
+        <w:rPr>
+          <w:rFonts w:ascii="Consolas" w:hAnsi="Consolas"/>
+          <w:color w:val="172B4D"/>
+          <w:sz w:val="18"/>
+        </w:rPr>
+        <w:t>Girteka Dedicated</w:t>
+      </w:r>
+      <w:r>
+        <w:t xml:space="preserve">. These Jira values all represent Girteka Dedicated. The mover keeps the existing email local part but uses </w:t>
+      </w:r>
+      <w:r>
+        <w:rPr>
+          <w:rFonts w:ascii="Consolas" w:hAnsi="Consolas"/>
+          <w:color w:val="172B4D"/>
+          <w:sz w:val="18"/>
+        </w:rPr>
+        <w:t>@girteka.eu</w:t>
+      </w:r>
+      <w:r>
+        <w:t xml:space="preserve">; the workflow also aligns </w:t>
+      </w:r>
+      <w:r>
+        <w:rPr>
+          <w:rFonts w:ascii="Consolas" w:hAnsi="Consolas"/>
+          <w:color w:val="172B4D"/>
+          <w:sz w:val="18"/>
+        </w:rPr>
+        <w:t>targetAddress</w:t>
+      </w:r>
+      <w:r>
+        <w:t xml:space="preserve"> and the primary SMTP proxy and removes any retired </w:t>
+      </w:r>
+      <w:r>
+        <w:rPr>
+          <w:rFonts w:ascii="Consolas" w:hAnsi="Consolas"/>
+          <w:color w:val="172B4D"/>
+          <w:sz w:val="18"/>
+        </w:rPr>
+        <w:t>@tndmtrucking.com</w:t>
+      </w:r>
+      <w:r>
+        <w:t xml:space="preserve"> proxy. Password and UPN remain unchanged.</w:t>
       </w:r>
     </w:p>
     <w:p>
@@ -492,7 +563,7 @@
             <w:color w:val="0C66E4"/>
             <w:u w:val="single"/>
           </w:rPr>
-          <w:t>Jira Reminders v1.5.3 release</w:t>
+          <w:t>Jira Reminders v1.6.0 release</w:t>
         </w:r>
       </w:hyperlink>
       <w:r>
@@ -514,7 +585,7 @@
             <w:color w:val="0C66E4"/>
             <w:u w:val="single"/>
           </w:rPr>
-          <w:t>Jira-Reminders-1.5.3.msi</w:t>
+          <w:t>Jira-Reminders-1.6.0.msi</w:t>
         </w:r>
       </w:hyperlink>
       <w:r>
@@ -627,7 +698,7 @@
               <w:t>Unknown publisher:</w:t>
             </w:r>
             <w:r>
-              <w:t xml:space="preserve"> Version 1.5.3 is not Authenticode-signed, so Windows may show an </w:t>
+              <w:t xml:space="preserve"> Version 1.6.0 is not Authenticode-signed, so Windows may show an </w:t>
             </w:r>
             <w:r>
               <w:rPr>
@@ -1968,7 +2039,18 @@
     </w:p>
     <w:p>
       <w:r>
-        <w:t>Recognised Vilnius companies include Trucks Merchant, Willgrow, GCC, TNDM Trucking, Girteka Nordic, Girteka Transport, Girteka, Girteka Group, Girteka Logistics, ME Trailers, and Girteka Cargo.</w:t>
+        <w:t xml:space="preserve">Recognised Vilnius companies include Trucks Merchant, Willgrow, GCC, TNDM/TNDM Trucking, Girteka Dedicated, Girteka Nordic, Girteka Transport, Girteka, Girteka Group, Girteka Logistics, ME Trailers, and Girteka Cargo. Both the old and new Dedicated names use Girteka attributes, the standard Girteka email format, and the </w:t>
+      </w:r>
+      <w:r>
+        <w:rPr>
+          <w:rFonts w:ascii="Consolas" w:hAnsi="Consolas"/>
+          <w:color w:val="172B4D"/>
+          <w:sz w:val="18"/>
+        </w:rPr>
+        <w:t>@girteka.eu</w:t>
+      </w:r>
+      <w:r>
+        <w:t xml:space="preserve"> domain during onboarding.</w:t>
       </w:r>
     </w:p>
     <w:p>
@@ -2013,6 +2095,56 @@
       </w:r>
       <w:r>
         <w:t>.</w:t>
+      </w:r>
+    </w:p>
+    <w:p>
+      <w:pPr>
+        <w:pStyle w:val="ListBullet"/>
+      </w:pPr>
+      <w:r>
+        <w:t>Snipe-IT access is read-only and is used only to display assets already</w:t>
+      </w:r>
+    </w:p>
+    <w:p>
+      <w:r>
+        <w:t>assigned to a joiner.</w:t>
+      </w:r>
+    </w:p>
+    <w:p>
+      <w:pPr>
+        <w:pStyle w:val="ListBullet"/>
+      </w:pPr>
+      <w:r>
+        <w:t>Each AD setup starts with a freshly generated random password. Completed</w:t>
+      </w:r>
+    </w:p>
+    <w:p>
+      <w:r>
+        <w:t xml:space="preserve">handoff passwords are stored in Windows Credential Manager, not in </w:t>
+      </w:r>
+      <w:r>
+        <w:rPr>
+          <w:rFonts w:ascii="Consolas" w:hAnsi="Consolas"/>
+          <w:color w:val="172B4D"/>
+          <w:sz w:val="18"/>
+        </w:rPr>
+        <w:t>tasks.json</w:t>
+      </w:r>
+      <w:r>
+        <w:t xml:space="preserve"> or its new backups.</w:t>
+      </w:r>
+    </w:p>
+    <w:p>
+      <w:pPr>
+        <w:pStyle w:val="ListBullet"/>
+      </w:pPr>
+      <w:r>
+        <w:t>Passwords are masked in the AD wizard and sensitive clipboard copies clear</w:t>
+      </w:r>
+    </w:p>
+    <w:p>
+      <w:r>
+        <w:t>automatically after 30 seconds.</w:t>
       </w:r>
     </w:p>
     <w:p>
@@ -2697,7 +2829,7 @@
             <w:color w:val="0C66E4"/>
             <w:u w:val="single"/>
           </w:rPr>
-          <w:t>Jira Reminders v1.5.3 release</w:t>
+          <w:t>Jira Reminders v1.6.0 release</w:t>
         </w:r>
       </w:hyperlink>
     </w:p>

</xml_diff>